<commit_message>
Proof pass 2: the 206 open questions of the 2026-09-15 proof log worked through (D107)
229 exact text fixes across 114 source files: arithmetic and counts, slide and part numbers, day counts, stale references to older versions of lessons, build notes reworded into plain teacher notes, verbatim National FCS descriptors paraphrased per the crosswalk rule, and 25 National FCS numbers checked against the 3.0 text and listed in the crosswalk (E.7). 24 questions that need the teacher's own call are listed for him.

Co-Authored-By: Claude Fable 5.1 <noreply@anthropic.com>
Claude-Session: https://claude.ai/code/session_01TaQLEJCtq2ruLJPqxdFc8k
</commit_message>
<xml_diff>
--- a/downloads/documents/02 Standards/STANDARDS CROSSWALK.docx
+++ b/downloads/documents/02 Standards/STANDARDS CROSSWALK.docx
@@ -17653,10 +17653,345 @@
         <w:t xml:space="preserve">”</w:t>
       </w:r>
     </w:p>
+    <w:p>
+      <w:pPr>
+        <w:pStyle w:val="Heading3"/>
+      </w:pPr>
+      <w:bookmarkStart w:id="52" w:name="X64cf26258963537654e01a1e724e652991d6533"/>
+      <w:r>
+        <w:t xml:space="preserve">E.7 National FCS 3.0 numbers cited on lesson pages that Part B does not carry: checked 2026-09-22 against the 3.0 text in</w:t>
+      </w:r>
+      <w:r>
+        <w:t xml:space="preserve"> </w:t>
+      </w:r>
+      <w:r>
+        <w:rPr>
+          <w:rStyle w:val="VerbatimChar"/>
+        </w:rPr>
+        <w:t xml:space="preserve">STANDARDS SOURCES - web research.md</w:t>
+      </w:r>
+      <w:bookmarkEnd w:id="52"/>
+    </w:p>
+    <w:p>
+      <w:pPr>
+        <w:pStyle w:val="FirstParagraph"/>
+      </w:pPr>
+      <w:r>
+        <w:t xml:space="preserve">The 2026-09-15 proof pass flagged every National FCS number that a lesson, assessment or rubric cites without a Part B row. Each one below is a real 3.0 competency, confirmed word for word in the research file; the descriptor here is the build’s paraphrase (A.5), and the parenthesis says where it is cited. A number missing from this list and from Part B is still not citable until it is checked the same way.</w:t>
+      </w:r>
+    </w:p>
+    <w:p>
+      <w:pPr>
+        <w:numPr>
+          <w:ilvl w:val="0"/>
+          <w:numId w:val="1013"/>
+        </w:numPr>
+        <w:pStyle w:val="Compact"/>
+      </w:pPr>
+      <w:r>
+        <w:t xml:space="preserve">1.1.6 Build a life plan that lays out how to gain what a person must know and be able to do to reach personal, family, and career goals. (Lessons 2.22, 7.12; Unit 07 plan)</w:t>
+      </w:r>
+    </w:p>
+    <w:p>
+      <w:pPr>
+        <w:numPr>
+          <w:ilvl w:val="0"/>
+          <w:numId w:val="1013"/>
+        </w:numPr>
+        <w:pStyle w:val="Compact"/>
+      </w:pPr>
+      <w:r>
+        <w:t xml:space="preserve">1.2.6 Show leadership in school, work, and community settings. (Lesson 7.9; Rubric 07)</w:t>
+      </w:r>
+    </w:p>
+    <w:p>
+      <w:pPr>
+        <w:numPr>
+          <w:ilvl w:val="0"/>
+          <w:numId w:val="1013"/>
+        </w:numPr>
+        <w:pStyle w:val="Compact"/>
+      </w:pPr>
+      <w:r>
+        <w:t xml:space="preserve">2.5.2 Examine the parts individuals and families play in the economic system. (Unit 07 plan)</w:t>
+      </w:r>
+    </w:p>
+    <w:p>
+      <w:pPr>
+        <w:numPr>
+          <w:ilvl w:val="0"/>
+          <w:numId w:val="1013"/>
+        </w:numPr>
+        <w:pStyle w:val="Compact"/>
+      </w:pPr>
+      <w:r>
+        <w:t xml:space="preserve">3.1.5 Put together a portfolio that shows the skills consumer services careers call for. (Lessons 7.2, 7.12)</w:t>
+      </w:r>
+    </w:p>
+    <w:p>
+      <w:pPr>
+        <w:numPr>
+          <w:ilvl w:val="0"/>
+          <w:numId w:val="1013"/>
+        </w:numPr>
+        <w:pStyle w:val="Compact"/>
+      </w:pPr>
+      <w:r>
+        <w:t xml:space="preserve">3.3.8 Examine what builds or damages a credit rating and how a rating changes the rates and terms a borrower gets. (Lesson 2.11)</w:t>
+      </w:r>
+    </w:p>
+    <w:p>
+      <w:pPr>
+        <w:numPr>
+          <w:ilvl w:val="0"/>
+          <w:numId w:val="1013"/>
+        </w:numPr>
+        <w:pStyle w:val="Compact"/>
+      </w:pPr>
+      <w:r>
+        <w:t xml:space="preserve">3.5.6 Judge the labeling, packaging, and support materials that come with consumer goods. (Lesson 1.11; Assessment 01.3)</w:t>
+      </w:r>
+    </w:p>
+    <w:p>
+      <w:pPr>
+        <w:numPr>
+          <w:ilvl w:val="0"/>
+          <w:numId w:val="1013"/>
+        </w:numPr>
+        <w:pStyle w:val="Compact"/>
+      </w:pPr>
+      <w:r>
+        <w:t xml:space="preserve">8.4.2 Use menu-planning principles to build and adjust menus. (Lesson 6.12)</w:t>
+      </w:r>
+    </w:p>
+    <w:p>
+      <w:pPr>
+        <w:numPr>
+          <w:ilvl w:val="0"/>
+          <w:numId w:val="1013"/>
+        </w:numPr>
+        <w:pStyle w:val="Compact"/>
+      </w:pPr>
+      <w:r>
+        <w:t xml:space="preserve">8.4.3 Work out the food, equipment, and supplies a menu needs. (Lesson 6.14; Rubric 06)</w:t>
+      </w:r>
+    </w:p>
+    <w:p>
+      <w:pPr>
+        <w:numPr>
+          <w:ilvl w:val="0"/>
+          <w:numId w:val="1013"/>
+        </w:numPr>
+        <w:pStyle w:val="Compact"/>
+      </w:pPr>
+      <w:r>
+        <w:t xml:space="preserve">8.4.7 Use measurement, portion control, conversions, food cost, menu terms, and menu pricing when planning a menu. (Lesson 6.13)</w:t>
+      </w:r>
+    </w:p>
+    <w:p>
+      <w:pPr>
+        <w:numPr>
+          <w:ilvl w:val="0"/>
+          <w:numId w:val="1013"/>
+        </w:numPr>
+        <w:pStyle w:val="Compact"/>
+      </w:pPr>
+      <w:r>
+        <w:t xml:space="preserve">8.6.1 Use the principles of purchasing, receiving, and storing in a food service operation. (Lesson 6.15)</w:t>
+      </w:r>
+    </w:p>
+    <w:p>
+      <w:pPr>
+        <w:numPr>
+          <w:ilvl w:val="0"/>
+          <w:numId w:val="1013"/>
+        </w:numPr>
+        <w:pStyle w:val="Compact"/>
+      </w:pPr>
+      <w:r>
+        <w:t xml:space="preserve">11.2.3 Examine what the principles and elements of design do to how a space looks and works. (Lessons 4.6, 4.8, 4.9; Assessment 04.2)</w:t>
+      </w:r>
+    </w:p>
+    <w:p>
+      <w:pPr>
+        <w:numPr>
+          <w:ilvl w:val="0"/>
+          <w:numId w:val="1013"/>
+        </w:numPr>
+        <w:pStyle w:val="Compact"/>
+      </w:pPr>
+      <w:r>
+        <w:t xml:space="preserve">11.2.4 Design housing, interiors, and furnishings around how people behave, move, and measure. (Lessons 4.10, 4.11)</w:t>
+      </w:r>
+    </w:p>
+    <w:p>
+      <w:pPr>
+        <w:numPr>
+          <w:ilvl w:val="0"/>
+          <w:numId w:val="1013"/>
+        </w:numPr>
+        <w:pStyle w:val="Compact"/>
+      </w:pPr>
+      <w:r>
+        <w:t xml:space="preserve">11.3.1 Examine product information for floor and wall coverings, textiles, window treatments, furniture, and lighting. (Assessment 04.2)</w:t>
+      </w:r>
+    </w:p>
+    <w:p>
+      <w:pPr>
+        <w:numPr>
+          <w:ilvl w:val="0"/>
+          <w:numId w:val="1013"/>
+        </w:numPr>
+        <w:pStyle w:val="Compact"/>
+      </w:pPr>
+      <w:r>
+        <w:t xml:space="preserve">11.6.4 Critique a design plan against the client’s needs, goals, and resources. (Lesson 4.15)</w:t>
+      </w:r>
+    </w:p>
+    <w:p>
+      <w:pPr>
+        <w:numPr>
+          <w:ilvl w:val="0"/>
+          <w:numId w:val="1013"/>
+        </w:numPr>
+        <w:pStyle w:val="Compact"/>
+      </w:pPr>
+      <w:r>
+        <w:t xml:space="preserve">11.6.5 Defend design choices in terms of the client’s needs, including diversity and culture, and the design process. (Lessons 4.11, 4.15; Rubric 04)</w:t>
+      </w:r>
+    </w:p>
+    <w:p>
+      <w:pPr>
+        <w:numPr>
+          <w:ilvl w:val="0"/>
+          <w:numId w:val="1013"/>
+        </w:numPr>
+        <w:pStyle w:val="Compact"/>
+      </w:pPr>
+      <w:r>
+        <w:t xml:space="preserve">12.1.3 Examine current research on human growth and development, brain research included. (Lesson 3.3; Assessment 03.1)</w:t>
+      </w:r>
+    </w:p>
+    <w:p>
+      <w:pPr>
+        <w:numPr>
+          <w:ilvl w:val="0"/>
+          <w:numId w:val="1013"/>
+        </w:numPr>
+        <w:pStyle w:val="Compact"/>
+      </w:pPr>
+      <w:r>
+        <w:t xml:space="preserve">13.3.6 Examine how technology changes communication at home, at work, and in the community. (Lesson 3.9)</w:t>
+      </w:r>
+    </w:p>
+    <w:p>
+      <w:pPr>
+        <w:numPr>
+          <w:ilvl w:val="0"/>
+          <w:numId w:val="1013"/>
+        </w:numPr>
+        <w:pStyle w:val="Compact"/>
+      </w:pPr>
+      <w:r>
+        <w:t xml:space="preserve">13.4.3 Use decision making and problem solving to reduce and manage conflict. (Lesson 3.11)</w:t>
+      </w:r>
+    </w:p>
+    <w:p>
+      <w:pPr>
+        <w:numPr>
+          <w:ilvl w:val="0"/>
+          <w:numId w:val="1013"/>
+        </w:numPr>
+        <w:pStyle w:val="Compact"/>
+      </w:pPr>
+      <w:r>
+        <w:t xml:space="preserve">13.5.1 Build a group climate where everyone’s ideas, perspectives, and contributions are welcomed and respected. (Lessons 0.1, 0.4)</w:t>
+      </w:r>
+    </w:p>
+    <w:p>
+      <w:pPr>
+        <w:numPr>
+          <w:ilvl w:val="0"/>
+          <w:numId w:val="1013"/>
+        </w:numPr>
+        <w:pStyle w:val="Compact"/>
+      </w:pPr>
+      <w:r>
+        <w:t xml:space="preserve">13.5.7 Show how to cooperate, compromise, and collaborate. (Lessons 0.3, 3.11, 3.13)</w:t>
+      </w:r>
+    </w:p>
+    <w:p>
+      <w:pPr>
+        <w:numPr>
+          <w:ilvl w:val="0"/>
+          <w:numId w:val="1013"/>
+        </w:numPr>
+        <w:pStyle w:val="Compact"/>
+      </w:pPr>
+      <w:r>
+        <w:t xml:space="preserve">15.2.4 Examine what abuse and neglect do to children and families, and how prevention works. (Lesson 3.17; Assessment 03.2)</w:t>
+      </w:r>
+    </w:p>
+    <w:p>
+      <w:pPr>
+        <w:numPr>
+          <w:ilvl w:val="0"/>
+          <w:numId w:val="1013"/>
+        </w:numPr>
+        <w:pStyle w:val="Compact"/>
+      </w:pPr>
+      <w:r>
+        <w:t xml:space="preserve">16.1.2 Examine openings for jobs and for starting a business in textiles and apparel. (Lesson 5.19)</w:t>
+      </w:r>
+    </w:p>
+    <w:p>
+      <w:pPr>
+        <w:numPr>
+          <w:ilvl w:val="0"/>
+          <w:numId w:val="1013"/>
+        </w:numPr>
+        <w:pStyle w:val="Compact"/>
+      </w:pPr>
+      <w:r>
+        <w:t xml:space="preserve">16.2.1 Use the right terms to identify, compare, and analyze the common textile fibers and fabrics. (Lesson 5.3; Handout 05.03)</w:t>
+      </w:r>
+    </w:p>
+    <w:p>
+      <w:pPr>
+        <w:numPr>
+          <w:ilvl w:val="0"/>
+          <w:numId w:val="1013"/>
+        </w:numPr>
+        <w:pStyle w:val="Compact"/>
+      </w:pPr>
+      <w:r>
+        <w:t xml:space="preserve">16.2.2 Judge how textile fibers and fabrics perform. (Lesson 5.3; Handout 05.03)</w:t>
+      </w:r>
+    </w:p>
+    <w:p>
+      <w:pPr>
+        <w:numPr>
+          <w:ilvl w:val="0"/>
+          <w:numId w:val="1013"/>
+        </w:numPr>
+        <w:pStyle w:val="Compact"/>
+      </w:pPr>
+      <w:r>
+        <w:t xml:space="preserve">16.3.3 Use the elements and principles of design when designing, making, or altering textiles and apparel. (Lesson 5.16)</w:t>
+      </w:r>
+    </w:p>
+    <w:p>
+      <w:pPr>
+        <w:pStyle w:val="FirstParagraph"/>
+      </w:pPr>
+      <w:r>
+        <w:t xml:space="preserve">Also confirmed: 1.2.7 (Part B carries it under ATPD and EDM; Lesson 1.3 cites it for kitchen safety, which the competency’s wording, safe and healthy school, work and community settings, covers) and 2.1.3 (Part B, N&amp;W rows; Assessment 06.3 cites it on the food decisions items).</w:t>
+      </w:r>
+    </w:p>
     <w:sectPr>
       <w:headerReference w:type="default" r:id="rId9"/>
       <w:pgSz w:w="12240" w:h="15840"/>
-      <w:pgMar w:top="1440" w:bottom="1440" w:left="1440" w:right="1440" w:header="504"/>
+      <w:pgMar w:top="1296" w:bottom="1296" w:left="1296" w:right="1296" w:header="504"/>
     </w:sectPr>
   </w:body>
 </w:document>
@@ -18114,6 +18449,9 @@
     <w:abstractNumId w:val="991"/>
   </w:num>
   <w:num w:numId="1012">
+    <w:abstractNumId w:val="991"/>
+  </w:num>
+  <w:num w:numId="1013">
     <w:abstractNumId w:val="991"/>
   </w:num>
 </w:numbering>

</xml_diff>

<commit_message>
The Gilded Age Market replaces ClassroomStreet (D109)
Topic 2.4 is now a paper market simulation, 1870 to 1932 with a 1936 close:
real companies, simplified prices, $1,000 paper dollars, a paper ledger, eight
dispatches, and Monopoly's origin. Lessons 2.14 to 2.19, Project 02, Rubric 02,
the kit, company cards, ledger and templates rewritten; 35 other pages lose the
site name. Three arcade games (Risk Ladder, Fact or Hype, Money Math) rebuilt on
the new market. The About page is teacher only: the body loads from the private
bucket for a signed in teacher and the nav hides it otherwise.

Co-Authored-By: Claude Fable 5.1 <noreply@anthropic.com>
Claude-Session: https://claude.ai/code/session_01TaQLEJCtq2ruLJPqxdFc8k
</commit_message>
<xml_diff>
--- a/downloads/documents/02 Standards/STANDARDS CROSSWALK.docx
+++ b/downloads/documents/02 Standards/STANDARDS CROSSWALK.docx
@@ -13034,7 +13034,7 @@
         <w:t xml:space="preserve"> </w:t>
       </w:r>
       <w:r>
-        <w:t xml:space="preserve">Units carrying it: U2 (primary: all six topics, Skittles market game, ClassroomStreet), U1 (primary: 4c, 4f, 4g, 4i, $40 project), U5 (primary: 4b, 4c, 4f, 4g, 4h), U6 (primary: 4c, 4e, 4f, 4g, 4h), U4 (4c, 4f, 4g), U3 (4b, 4c, 4e), U7 (1a, 1b, 6a, 6b). The state’s own note: every content module except HDR has a Consumer Resources and Finance topic.</w:t>
+        <w:t xml:space="preserve">Units carrying it: U2 (primary: all six topics, Skittles market game, the Gilded Age Market), U1 (primary: 4c, 4f, 4g, 4i, $40 project), U5 (primary: 4b, 4c, 4f, 4g, 4h), U6 (primary: 4c, 4e, 4f, 4g, 4h), U4 (4c, 4f, 4g), U3 (4b, 4c, 4e), U7 (1a, 1b, 6a, 6b). The state’s own note: every content module except HDR has a Consumer Resources and Finance topic.</w:t>
       </w:r>
       <w:r>
         <w:t xml:space="preserve"> </w:t>
@@ -17560,7 +17560,16 @@
         <w:pStyle w:val="Compact"/>
       </w:pPr>
       <w:r>
-        <w:t xml:space="preserve">ClassroomStreet.com: only the stock trading simulation is publicly visible. The budgeting mode the U2 project depends on needs screenshots or a walkthrough so the lesson can name real screens.</w:t>
+        <w:t xml:space="preserve">The U2 market is on paper. The Gilded Age Market (</w:t>
+      </w:r>
+      <w:r>
+        <w:rPr>
+          <w:rStyle w:val="VerbatimChar"/>
+        </w:rPr>
+        <w:t xml:space="preserve">05 Materials/Unit 02/Handouts/Handout 02.14 - The Gilded Age Market Kit.md</w:t>
+      </w:r>
+      <w:r>
+        <w:t xml:space="preserve">) needs no website, login or device; nothing here for the teacher to check by hand beyond printing the kit.</w:t>
       </w:r>
     </w:p>
     <w:p>

</xml_diff>

<commit_message>
Proof pass 3 and the readability pass (D110, D111)
The 23 open proof calls applied: one set of eight lab roles for all three
Unit 1 labs, the Label Reading Quiz on Lesson 1.13 Day 1, nineteen tools, the
two dinners priced to their totals, Standard 3 indicators in Lessons 3.14 and
3.19, three emergency numbers, the Unit 04 plan re synced, a buyer card on
Handout 05.12, a machine item on the Unit 5 test, a class of 30 in Unit 7, the
crosswalk marks. The Gilded Age Market proofread as a teacher would run it.
Every handout, slide outline, project, rubric, assessment and the syllabus read
for a fifth and sixth grade reader and for sense: short sentences, verb first
directions, hard words defined, two part questions split, every writing line
labelled, and the proven errors fixed everywhere they appear.

Co-Authored-By: Claude Fable 5.1 <noreply@anthropic.com>
Claude-Session: https://claude.ai/code/session_01TaQLEJCtq2ruLJPqxdFc8k
</commit_message>
<xml_diff>
--- a/downloads/documents/02 Standards/STANDARDS CROSSWALK.docx
+++ b/downloads/documents/02 Standards/STANDARDS CROSSWALK.docx
@@ -5736,7 +5736,7 @@
               <w:jc w:val="left"/>
             </w:pPr>
             <w:r>
-              <w:t xml:space="preserve">U3 (U7)</w:t>
+              <w:t xml:space="preserve">U3</w:t>
             </w:r>
           </w:p>
         </w:tc>
@@ -8659,7 +8659,7 @@
               <w:jc w:val="left"/>
             </w:pPr>
             <w:r>
-              <w:t xml:space="preserve">U4 (U7)</w:t>
+              <w:t xml:space="preserve">U4</w:t>
             </w:r>
           </w:p>
         </w:tc>
@@ -14962,7 +14962,7 @@
         <w:pStyle w:val="BodyText"/>
       </w:pPr>
       <w:r>
-        <w:t xml:space="preserve">How to read the secondary marks: U0 touches IGLR 3b, 3c; HDR 3b, 4a, 4c; EDM 1b, 1c (room safety); N&amp;W 1b and FSP 1c (kitchen safety agreement). U2 touches HDR 4g transitions; ATPD 4c and EDM 3a budgets; N&amp;W 3b shopping strategies. U3 touches IGLR 2c, 3e; FSP 4d hunger and community. U4 touches IGLR 4b; ATPD 2d repurposing. U5 touches IGLR 4b; HDR 2d image; EDM 2c design elements. U6 touches HDR 5d culture; ATPD 4d global responsibility; EDM 1d conservation; N&amp;W 1i, 3a to 3c. U7 touches IGLR 3d, 5b; HDR 2e; EDM 2e; N&amp;W 4b; FSP 6c career self-assessment.</w:t>
+        <w:t xml:space="preserve">How to read the secondary marks: U0 touches IGLR 3b, 3c; HDR 3b, 4a, 4c; EDM 1b, 1c (room safety); N&amp;W 1b and FSP 1c (kitchen safety agreement). U2 touches HDR 4g transitions; ATPD 4c and EDM 3a budgets; N&amp;W 3b shopping strategies. U3 touches IGLR 2c, 3e; FSP 4d hunger and community. U4 touches IGLR 4b; ATPD 2d repurposing. U5 touches IGLR 4b; HDR 2d image; EDM 2c design elements. U6 touches HDR 5d culture; ATPD 4d global responsibility; EDM 1d conservation; N&amp;W 1i, 3a to 3c. U7 touches IGLR 3d, 5b; HDR 2e; EDM 4c; N&amp;W 4b; FSP 6c career self-assessment.</w:t>
       </w:r>
     </w:p>
     <w:p>

</xml_diff>